<commit_message>
Redesign Task C deck, PDF exports, report voice pass
</commit_message>
<xml_diff>
--- a/deliverables/taskA_holidays/TaskA_Holiday_Scraper_Report.docx
+++ b/deliverables/taskA_holidays/TaskA_Holiday_Scraper_Report.docx
@@ -60,11 +60,13 @@
       <w:tblPr>
         <w:tblStyle w:val="TableGrid"/>
         <w:tblW w:type="auto" w:w="0"/>
+        <w:tblLayout w:type="fixed"/>
         <w:tblLook w:firstColumn="1" w:firstRow="1" w:lastColumn="0" w:lastRow="0" w:noHBand="0" w:noVBand="1" w:val="04A0"/>
+        <w:tblLayout w:type="fixed"/>
       </w:tblPr>
       <w:tblGrid>
-        <w:gridCol w:w="4706"/>
-        <w:gridCol w:w="4706"/>
+        <w:gridCol w:w="2551"/>
+        <w:gridCol w:w="6860"/>
       </w:tblGrid>
       <w:tr>
         <w:tc>
@@ -83,7 +85,7 @@
         </w:tc>
         <w:tc>
           <w:tcPr>
-            <w:tcW w:type="dxa" w:w="6803"/>
+            <w:tcW w:type="dxa" w:w="6860"/>
           </w:tcPr>
           <w:p>
             <w:r>
@@ -109,11 +111,11 @@
         </w:tc>
         <w:tc>
           <w:tcPr>
-            <w:tcW w:type="dxa" w:w="6803"/>
+            <w:tcW w:type="dxa" w:w="6860"/>
           </w:tcPr>
           <w:p>
             <w:r>
-              <w:t>60 — NYSE 34, NASDAQ 12, OPRA 14, CME 0</w:t>
+              <w:t>60: NYSE 34, NASDAQ 12, OPRA 14, CME 0</w:t>
             </w:r>
           </w:p>
         </w:tc>
@@ -135,7 +137,7 @@
         </w:tc>
         <w:tc>
           <w:tcPr>
-            <w:tcW w:type="dxa" w:w="6803"/>
+            <w:tcW w:type="dxa" w:w="6860"/>
           </w:tcPr>
           <w:p>
             <w:r>
@@ -161,11 +163,11 @@
         </w:tc>
         <w:tc>
           <w:tcPr>
-            <w:tcW w:type="dxa" w:w="6803"/>
+            <w:tcW w:type="dxa" w:w="6860"/>
           </w:tcPr>
           <w:p>
             <w:r>
-              <w:t>.github/workflows/trading-holidays.yml — weekly and on demand</w:t>
+              <w:t>.github/workflows/trading-holidays.yml, weekly and on demand</w:t>
             </w:r>
           </w:p>
         </w:tc>
@@ -187,7 +189,7 @@
         </w:tc>
         <w:tc>
           <w:tcPr>
-            <w:tcW w:type="dxa" w:w="6803"/>
+            <w:tcW w:type="dxa" w:w="6860"/>
           </w:tcPr>
           <w:p>
             <w:r>
@@ -232,7 +234,9 @@
       <w:tblPr>
         <w:tblW w:type="auto" w:w="0"/>
         <w:jc w:val="center"/>
+        <w:tblLayout w:type="fixed"/>
         <w:tblLook w:firstColumn="1" w:firstRow="1" w:lastColumn="0" w:lastRow="0" w:noHBand="0" w:noVBand="1" w:val="04A0"/>
+        <w:tblLayout w:type="fixed"/>
       </w:tblPr>
       <w:tblGrid>
         <w:gridCol w:w="1882"/>
@@ -432,6 +436,7 @@
     <w:p/>
     <w:p>
       <w:pPr>
+        <w:keepNext/>
         <w:jc w:val="center"/>
       </w:pPr>
       <w:r>
@@ -487,7 +492,7 @@
           <w:color w:val="5C677D"/>
           <w:sz w:val="19"/>
         </w:rPr>
-        <w:t>Rows per exchange in the live run. CME is empty on purpose — see section 5.4.</w:t>
+        <w:t>Rows per exchange in the live run. CME is empty on purpose (see section 5.4).</w:t>
       </w:r>
     </w:p>
     <w:p>
@@ -495,7 +500,7 @@
         <w:rPr>
           <w:i w:val="0"/>
         </w:rPr>
-        <w:t>The result is WARN rather than PASS, and that is the honest outcome. The equity calendars pass every check and agree with each other date for date. The warnings are the three things I could not legitimately fetch: CME (its terms forbid scraping), and OPRA having only a 2025 schedule online, so it shares no year with NYSE or NASDAQ for a cross-check.</w:t>
+        <w:t>The result is WARN rather than PASS, and that is the right outcome. The equity calendars pass every check and agree with each other date for date. The warnings are the three things I could not legitimately fetch: CME (its terms forbid scraping), and OPRA having only a 2025 schedule online, so it shares no year with NYSE or NASDAQ for a cross-check.</w:t>
       </w:r>
     </w:p>
     <w:p>
@@ -511,7 +516,7 @@
         <w:rPr>
           <w:i w:val="0"/>
         </w:rPr>
-        <w:t>These four CSVs are the deliverable. The uploader finds each file by name and overwrites it, so a weekly run never creates duplicates — which is why the names must not change.</w:t>
+        <w:t>These four CSVs are the deliverable. The uploader finds each file by name and overwrites it, so a weekly run never creates duplicates. That is why the names must not change.</w:t>
       </w:r>
     </w:p>
     <w:tbl>
@@ -519,21 +524,30 @@
         <w:tblStyle w:val="TableGrid"/>
         <w:tblW w:type="auto" w:w="0"/>
         <w:jc w:val="center"/>
+        <w:tblLayout w:type="fixed"/>
         <w:tblLook w:firstColumn="1" w:firstRow="1" w:lastColumn="0" w:lastRow="0" w:noHBand="0" w:noVBand="1" w:val="04A0"/>
+        <w:tblLayout w:type="fixed"/>
       </w:tblPr>
       <w:tblGrid>
-        <w:gridCol w:w="2353"/>
-        <w:gridCol w:w="2353"/>
-        <w:gridCol w:w="2353"/>
-        <w:gridCol w:w="2353"/>
+        <w:gridCol w:w="3175"/>
+        <w:gridCol w:w="3515"/>
+        <w:gridCol w:w="907"/>
+        <w:gridCol w:w="1474"/>
       </w:tblGrid>
       <w:tr>
+        <w:trPr>
+          <w:cantSplit/>
+          <w:tblHeader/>
+        </w:trPr>
         <w:tc>
           <w:tcPr>
             <w:tcW w:type="dxa" w:w="3175"/>
             <w:shd w:val="clear" w:color="auto" w:fill="14213D"/>
           </w:tcPr>
           <w:p>
+            <w:pPr>
+              <w:keepNext/>
+            </w:pPr>
             <w:r/>
             <w:r>
               <w:rPr>
@@ -551,6 +565,9 @@
             <w:shd w:val="clear" w:color="auto" w:fill="14213D"/>
           </w:tcPr>
           <w:p>
+            <w:pPr>
+              <w:keepNext/>
+            </w:pPr>
             <w:r/>
             <w:r>
               <w:rPr>
@@ -568,6 +585,9 @@
             <w:shd w:val="clear" w:color="auto" w:fill="14213D"/>
           </w:tcPr>
           <w:p>
+            <w:pPr>
+              <w:keepNext/>
+            </w:pPr>
             <w:r/>
             <w:r>
               <w:rPr>
@@ -585,6 +605,9 @@
             <w:shd w:val="clear" w:color="auto" w:fill="14213D"/>
           </w:tcPr>
           <w:p>
+            <w:pPr>
+              <w:keepNext/>
+            </w:pPr>
             <w:r/>
             <w:r>
               <w:rPr>
@@ -598,11 +621,17 @@
         </w:tc>
       </w:tr>
       <w:tr>
+        <w:trPr>
+          <w:cantSplit/>
+        </w:trPr>
         <w:tc>
           <w:tcPr>
             <w:tcW w:type="dxa" w:w="3175"/>
           </w:tcPr>
           <w:p>
+            <w:pPr>
+              <w:keepNext/>
+            </w:pPr>
             <w:r/>
             <w:r>
               <w:rPr>
@@ -617,6 +646,9 @@
             <w:tcW w:type="dxa" w:w="3515"/>
           </w:tcPr>
           <w:p>
+            <w:pPr>
+              <w:keepNext/>
+            </w:pPr>
             <w:r/>
             <w:r>
               <w:rPr>
@@ -631,6 +663,9 @@
             <w:tcW w:type="dxa" w:w="907"/>
           </w:tcPr>
           <w:p>
+            <w:pPr>
+              <w:keepNext/>
+            </w:pPr>
             <w:r/>
             <w:r>
               <w:rPr>
@@ -645,6 +680,9 @@
             <w:tcW w:type="dxa" w:w="1474"/>
           </w:tcPr>
           <w:p>
+            <w:pPr>
+              <w:keepNext/>
+            </w:pPr>
             <w:r/>
             <w:r>
               <w:rPr>
@@ -656,12 +694,18 @@
         </w:tc>
       </w:tr>
       <w:tr>
+        <w:trPr>
+          <w:cantSplit/>
+        </w:trPr>
         <w:tc>
           <w:tcPr>
             <w:tcW w:type="dxa" w:w="3175"/>
             <w:shd w:val="clear" w:color="auto" w:fill="F4F6FA"/>
           </w:tcPr>
           <w:p>
+            <w:pPr>
+              <w:keepNext/>
+            </w:pPr>
             <w:r/>
             <w:r>
               <w:rPr>
@@ -677,6 +721,9 @@
             <w:shd w:val="clear" w:color="auto" w:fill="F4F6FA"/>
           </w:tcPr>
           <w:p>
+            <w:pPr>
+              <w:keepNext/>
+            </w:pPr>
             <w:r/>
             <w:r>
               <w:rPr>
@@ -692,6 +739,9 @@
             <w:shd w:val="clear" w:color="auto" w:fill="F4F6FA"/>
           </w:tcPr>
           <w:p>
+            <w:pPr>
+              <w:keepNext/>
+            </w:pPr>
             <w:r/>
             <w:r>
               <w:rPr>
@@ -707,6 +757,9 @@
             <w:shd w:val="clear" w:color="auto" w:fill="F4F6FA"/>
           </w:tcPr>
           <w:p>
+            <w:pPr>
+              <w:keepNext/>
+            </w:pPr>
             <w:r/>
             <w:r>
               <w:rPr>
@@ -718,11 +771,17 @@
         </w:tc>
       </w:tr>
       <w:tr>
+        <w:trPr>
+          <w:cantSplit/>
+        </w:trPr>
         <w:tc>
           <w:tcPr>
             <w:tcW w:type="dxa" w:w="3175"/>
           </w:tcPr>
           <w:p>
+            <w:pPr>
+              <w:keepNext/>
+            </w:pPr>
             <w:r/>
             <w:r>
               <w:rPr>
@@ -737,6 +796,9 @@
             <w:tcW w:type="dxa" w:w="3515"/>
           </w:tcPr>
           <w:p>
+            <w:pPr>
+              <w:keepNext/>
+            </w:pPr>
             <w:r/>
             <w:r>
               <w:rPr>
@@ -751,6 +813,9 @@
             <w:tcW w:type="dxa" w:w="907"/>
           </w:tcPr>
           <w:p>
+            <w:pPr>
+              <w:keepNext/>
+            </w:pPr>
             <w:r/>
             <w:r>
               <w:rPr>
@@ -765,6 +830,9 @@
             <w:tcW w:type="dxa" w:w="1474"/>
           </w:tcPr>
           <w:p>
+            <w:pPr>
+              <w:keepNext/>
+            </w:pPr>
             <w:r/>
             <w:r>
               <w:rPr>
@@ -776,6 +844,9 @@
         </w:tc>
       </w:tr>
       <w:tr>
+        <w:trPr>
+          <w:cantSplit/>
+        </w:trPr>
         <w:tc>
           <w:tcPr>
             <w:tcW w:type="dxa" w:w="3175"/>
@@ -852,19 +923,28 @@
         <w:tblStyle w:val="TableGrid"/>
         <w:tblW w:type="auto" w:w="0"/>
         <w:jc w:val="center"/>
+        <w:tblLayout w:type="fixed"/>
         <w:tblLook w:firstColumn="1" w:firstRow="1" w:lastColumn="0" w:lastRow="0" w:noHBand="0" w:noVBand="1" w:val="04A0"/>
+        <w:tblLayout w:type="fixed"/>
       </w:tblPr>
       <w:tblGrid>
-        <w:gridCol w:w="4706"/>
-        <w:gridCol w:w="4706"/>
+        <w:gridCol w:w="3402"/>
+        <w:gridCol w:w="6009"/>
       </w:tblGrid>
       <w:tr>
+        <w:trPr>
+          <w:cantSplit/>
+          <w:tblHeader/>
+        </w:trPr>
         <w:tc>
           <w:tcPr>
             <w:tcW w:type="dxa" w:w="3402"/>
             <w:shd w:val="clear" w:color="auto" w:fill="14213D"/>
           </w:tcPr>
           <w:p>
+            <w:pPr>
+              <w:keepNext/>
+            </w:pPr>
             <w:r/>
             <w:r>
               <w:rPr>
@@ -882,6 +962,9 @@
             <w:shd w:val="clear" w:color="auto" w:fill="14213D"/>
           </w:tcPr>
           <w:p>
+            <w:pPr>
+              <w:keepNext/>
+            </w:pPr>
             <w:r/>
             <w:r>
               <w:rPr>
@@ -895,11 +978,17 @@
         </w:tc>
       </w:tr>
       <w:tr>
+        <w:trPr>
+          <w:cantSplit/>
+        </w:trPr>
         <w:tc>
           <w:tcPr>
             <w:tcW w:type="dxa" w:w="3402"/>
           </w:tcPr>
           <w:p>
+            <w:pPr>
+              <w:keepNext/>
+            </w:pPr>
             <w:r/>
             <w:r>
               <w:rPr>
@@ -914,6 +1003,9 @@
             <w:tcW w:type="dxa" w:w="6009"/>
           </w:tcPr>
           <w:p>
+            <w:pPr>
+              <w:keepNext/>
+            </w:pPr>
             <w:r/>
             <w:r>
               <w:rPr>
@@ -925,12 +1017,18 @@
         </w:tc>
       </w:tr>
       <w:tr>
+        <w:trPr>
+          <w:cantSplit/>
+        </w:trPr>
         <w:tc>
           <w:tcPr>
             <w:tcW w:type="dxa" w:w="3402"/>
             <w:shd w:val="clear" w:color="auto" w:fill="F4F6FA"/>
           </w:tcPr>
           <w:p>
+            <w:pPr>
+              <w:keepNext/>
+            </w:pPr>
             <w:r/>
             <w:r>
               <w:rPr>
@@ -946,6 +1044,9 @@
             <w:shd w:val="clear" w:color="auto" w:fill="F4F6FA"/>
           </w:tcPr>
           <w:p>
+            <w:pPr>
+              <w:keepNext/>
+            </w:pPr>
             <w:r/>
             <w:r>
               <w:rPr>
@@ -957,11 +1058,17 @@
         </w:tc>
       </w:tr>
       <w:tr>
+        <w:trPr>
+          <w:cantSplit/>
+        </w:trPr>
         <w:tc>
           <w:tcPr>
             <w:tcW w:type="dxa" w:w="3402"/>
           </w:tcPr>
           <w:p>
+            <w:pPr>
+              <w:keepNext/>
+            </w:pPr>
             <w:r/>
             <w:r>
               <w:rPr>
@@ -976,6 +1083,9 @@
             <w:tcW w:type="dxa" w:w="6009"/>
           </w:tcPr>
           <w:p>
+            <w:pPr>
+              <w:keepNext/>
+            </w:pPr>
             <w:r/>
             <w:r>
               <w:rPr>
@@ -987,12 +1097,18 @@
         </w:tc>
       </w:tr>
       <w:tr>
+        <w:trPr>
+          <w:cantSplit/>
+        </w:trPr>
         <w:tc>
           <w:tcPr>
             <w:tcW w:type="dxa" w:w="3402"/>
             <w:shd w:val="clear" w:color="auto" w:fill="F4F6FA"/>
           </w:tcPr>
           <w:p>
+            <w:pPr>
+              <w:keepNext/>
+            </w:pPr>
             <w:r/>
             <w:r>
               <w:rPr>
@@ -1008,6 +1124,9 @@
             <w:shd w:val="clear" w:color="auto" w:fill="F4F6FA"/>
           </w:tcPr>
           <w:p>
+            <w:pPr>
+              <w:keepNext/>
+            </w:pPr>
             <w:r/>
             <w:r>
               <w:rPr>
@@ -1019,11 +1138,17 @@
         </w:tc>
       </w:tr>
       <w:tr>
+        <w:trPr>
+          <w:cantSplit/>
+        </w:trPr>
         <w:tc>
           <w:tcPr>
             <w:tcW w:type="dxa" w:w="3402"/>
           </w:tcPr>
           <w:p>
+            <w:pPr>
+              <w:keepNext/>
+            </w:pPr>
             <w:r/>
             <w:r>
               <w:rPr>
@@ -1038,6 +1163,9 @@
             <w:tcW w:type="dxa" w:w="6009"/>
           </w:tcPr>
           <w:p>
+            <w:pPr>
+              <w:keepNext/>
+            </w:pPr>
             <w:r/>
             <w:r>
               <w:rPr>
@@ -1049,12 +1177,18 @@
         </w:tc>
       </w:tr>
       <w:tr>
+        <w:trPr>
+          <w:cantSplit/>
+        </w:trPr>
         <w:tc>
           <w:tcPr>
             <w:tcW w:type="dxa" w:w="3402"/>
             <w:shd w:val="clear" w:color="auto" w:fill="F4F6FA"/>
           </w:tcPr>
           <w:p>
+            <w:pPr>
+              <w:keepNext/>
+            </w:pPr>
             <w:r/>
             <w:r>
               <w:rPr>
@@ -1070,6 +1204,9 @@
             <w:shd w:val="clear" w:color="auto" w:fill="F4F6FA"/>
           </w:tcPr>
           <w:p>
+            <w:pPr>
+              <w:keepNext/>
+            </w:pPr>
             <w:r/>
             <w:r>
               <w:rPr>
@@ -1081,6 +1218,9 @@
         </w:tc>
       </w:tr>
       <w:tr>
+        <w:trPr>
+          <w:cantSplit/>
+        </w:trPr>
         <w:tc>
           <w:tcPr>
             <w:tcW w:type="dxa" w:w="3402"/>
@@ -1113,11 +1253,6 @@
     </w:tbl>
     <w:p/>
     <w:p>
-      <w:r>
-        <w:br w:type="page"/>
-      </w:r>
-    </w:p>
-    <w:p>
       <w:pPr>
         <w:pStyle w:val="Heading1"/>
       </w:pPr>
@@ -1127,6 +1262,7 @@
     </w:p>
     <w:p>
       <w:pPr>
+        <w:keepNext/>
         <w:jc w:val="center"/>
       </w:pPr>
       <w:r>
@@ -1198,7 +1334,7 @@
         <w:pStyle w:val="Heading2"/>
       </w:pPr>
       <w:r>
-        <w:t>Step 1 — Reconnaissance before any parser</w:t>
+        <w:t>Step 1: Reconnaissance before any parser</w:t>
       </w:r>
     </w:p>
     <w:p>
@@ -1214,20 +1350,29 @@
         <w:tblStyle w:val="TableGrid"/>
         <w:tblW w:type="auto" w:w="0"/>
         <w:jc w:val="center"/>
+        <w:tblLayout w:type="fixed"/>
         <w:tblLook w:firstColumn="1" w:firstRow="1" w:lastColumn="0" w:lastRow="0" w:noHBand="0" w:noVBand="1" w:val="04A0"/>
+        <w:tblLayout w:type="fixed"/>
       </w:tblPr>
       <w:tblGrid>
-        <w:gridCol w:w="3137"/>
-        <w:gridCol w:w="3137"/>
-        <w:gridCol w:w="3137"/>
+        <w:gridCol w:w="2154"/>
+        <w:gridCol w:w="4649"/>
+        <w:gridCol w:w="2608"/>
       </w:tblGrid>
       <w:tr>
+        <w:trPr>
+          <w:cantSplit/>
+          <w:tblHeader/>
+        </w:trPr>
         <w:tc>
           <w:tcPr>
             <w:tcW w:type="dxa" w:w="2154"/>
             <w:shd w:val="clear" w:color="auto" w:fill="14213D"/>
           </w:tcPr>
           <w:p>
+            <w:pPr>
+              <w:keepNext/>
+            </w:pPr>
             <w:r/>
             <w:r>
               <w:rPr>
@@ -1245,6 +1390,9 @@
             <w:shd w:val="clear" w:color="auto" w:fill="14213D"/>
           </w:tcPr>
           <w:p>
+            <w:pPr>
+              <w:keepNext/>
+            </w:pPr>
             <w:r/>
             <w:r>
               <w:rPr>
@@ -1262,6 +1410,9 @@
             <w:shd w:val="clear" w:color="auto" w:fill="14213D"/>
           </w:tcPr>
           <w:p>
+            <w:pPr>
+              <w:keepNext/>
+            </w:pPr>
             <w:r/>
             <w:r>
               <w:rPr>
@@ -1275,11 +1426,17 @@
         </w:tc>
       </w:tr>
       <w:tr>
+        <w:trPr>
+          <w:cantSplit/>
+        </w:trPr>
         <w:tc>
           <w:tcPr>
             <w:tcW w:type="dxa" w:w="2154"/>
           </w:tcPr>
           <w:p>
+            <w:pPr>
+              <w:keepNext/>
+            </w:pPr>
             <w:r/>
             <w:r>
               <w:rPr>
@@ -1294,6 +1451,9 @@
             <w:tcW w:type="dxa" w:w="4649"/>
           </w:tcPr>
           <w:p>
+            <w:pPr>
+              <w:keepNext/>
+            </w:pPr>
             <w:r/>
             <w:r>
               <w:rPr>
@@ -1308,6 +1468,9 @@
             <w:tcW w:type="dxa" w:w="2608"/>
           </w:tcPr>
           <w:p>
+            <w:pPr>
+              <w:keepNext/>
+            </w:pPr>
             <w:r/>
             <w:r>
               <w:rPr>
@@ -1319,12 +1482,18 @@
         </w:tc>
       </w:tr>
       <w:tr>
+        <w:trPr>
+          <w:cantSplit/>
+        </w:trPr>
         <w:tc>
           <w:tcPr>
             <w:tcW w:type="dxa" w:w="2154"/>
             <w:shd w:val="clear" w:color="auto" w:fill="F4F6FA"/>
           </w:tcPr>
           <w:p>
+            <w:pPr>
+              <w:keepNext/>
+            </w:pPr>
             <w:r/>
             <w:r>
               <w:rPr>
@@ -1340,6 +1509,9 @@
             <w:shd w:val="clear" w:color="auto" w:fill="F4F6FA"/>
           </w:tcPr>
           <w:p>
+            <w:pPr>
+              <w:keepNext/>
+            </w:pPr>
             <w:r/>
             <w:r>
               <w:rPr>
@@ -1355,6 +1527,9 @@
             <w:shd w:val="clear" w:color="auto" w:fill="F4F6FA"/>
           </w:tcPr>
           <w:p>
+            <w:pPr>
+              <w:keepNext/>
+            </w:pPr>
             <w:r/>
             <w:r>
               <w:rPr>
@@ -1366,11 +1541,17 @@
         </w:tc>
       </w:tr>
       <w:tr>
+        <w:trPr>
+          <w:cantSplit/>
+        </w:trPr>
         <w:tc>
           <w:tcPr>
             <w:tcW w:type="dxa" w:w="2154"/>
           </w:tcPr>
           <w:p>
+            <w:pPr>
+              <w:keepNext/>
+            </w:pPr>
             <w:r/>
             <w:r>
               <w:rPr>
@@ -1385,6 +1566,9 @@
             <w:tcW w:type="dxa" w:w="4649"/>
           </w:tcPr>
           <w:p>
+            <w:pPr>
+              <w:keepNext/>
+            </w:pPr>
             <w:r/>
             <w:r>
               <w:rPr>
@@ -1399,6 +1583,9 @@
             <w:tcW w:type="dxa" w:w="2608"/>
           </w:tcPr>
           <w:p>
+            <w:pPr>
+              <w:keepNext/>
+            </w:pPr>
             <w:r/>
             <w:r>
               <w:rPr>
@@ -1410,12 +1597,18 @@
         </w:tc>
       </w:tr>
       <w:tr>
+        <w:trPr>
+          <w:cantSplit/>
+        </w:trPr>
         <w:tc>
           <w:tcPr>
             <w:tcW w:type="dxa" w:w="2154"/>
             <w:shd w:val="clear" w:color="auto" w:fill="F4F6FA"/>
           </w:tcPr>
           <w:p>
+            <w:pPr>
+              <w:keepNext/>
+            </w:pPr>
             <w:r/>
             <w:r>
               <w:rPr>
@@ -1431,6 +1624,9 @@
             <w:shd w:val="clear" w:color="auto" w:fill="F4F6FA"/>
           </w:tcPr>
           <w:p>
+            <w:pPr>
+              <w:keepNext/>
+            </w:pPr>
             <w:r/>
             <w:r>
               <w:rPr>
@@ -1446,6 +1642,9 @@
             <w:shd w:val="clear" w:color="auto" w:fill="F4F6FA"/>
           </w:tcPr>
           <w:p>
+            <w:pPr>
+              <w:keepNext/>
+            </w:pPr>
             <w:r/>
             <w:r>
               <w:rPr>
@@ -1457,6 +1656,9 @@
         </w:tc>
       </w:tr>
       <w:tr>
+        <w:trPr>
+          <w:cantSplit/>
+        </w:trPr>
         <w:tc>
           <w:tcPr>
             <w:tcW w:type="dxa" w:w="2154"/>
@@ -1507,7 +1709,7 @@
         <w:pStyle w:val="Heading2"/>
       </w:pPr>
       <w:r>
-        <w:t>Step 2 — Fetch politely, keep everything</w:t>
+        <w:t>Step 2: Fetch politely, keep everything</w:t>
       </w:r>
     </w:p>
     <w:p>
@@ -1529,7 +1731,7 @@
         <w:t xml:space="preserve">401, 403, 404: </w:t>
       </w:r>
       <w:r>
-        <w:t>saved with an .httpNNN suffix and raised immediately — never retried. A site that has said no is not asked again.</w:t>
+        <w:t>saved with an .httpNNN suffix and raised immediately and never retried. A site that has said no is not asked again.</w:t>
       </w:r>
     </w:p>
     <w:p>
@@ -1565,7 +1767,7 @@
         <w:pStyle w:val="Heading2"/>
       </w:pPr>
       <w:r>
-        <w:t>Step 3 — Parse each exchange</w:t>
+        <w:t>Step 3: Parse each exchange</w:t>
       </w:r>
     </w:p>
     <w:p>
@@ -1581,7 +1783,7 @@
         <w:rPr>
           <w:i w:val="0"/>
         </w:rPr>
-        <w:t>The page has one table: holiday names down the side and one column per year. A cell with a date becomes a closed row for that year; a cell with a dash means 'not observed' and produces a note, not an invented date — New Year's Day 2028 falls on a Saturday and NYSE publishes a dash, so there is no row. Early closes are not in the table at all; they live in the footnotes ('…will close early at 1:00 p.m. on…'). The adapter keeps the footnote text, finds the time and the weekday dates in it, and turns each into an early_close row. Live result: 29 closes and 5 early closes across 2026–2028.</w:t>
+        <w:t>The page has one table: holiday names down the side and one column per year. A cell with a date becomes a closed row for that year; a cell with a dash means 'not observed' and produces a note, not an invented date: New Year's Day 2028 falls on a Saturday and NYSE publishes a dash, so there is no row. Early closes are not in the table at all; they live in the footnotes ('…will close early at 1:00 p.m. on…'). The adapter keeps the footnote text, finds the time and the weekday dates in it, and turns each into an early_close row. Live result: 29 closes and 5 early closes across 2026–2028.</w:t>
       </w:r>
     </w:p>
     <w:p>
@@ -1597,7 +1799,7 @@
         <w:rPr>
           <w:i w:val="0"/>
         </w:rPr>
-        <w:t>nasdaqtrader.com is tried first, with short timeouts. Its table is 'year | Holiday | Status'; a status containing a time is an early close at that local time. If it fails, headless Chromium opens the public nasdaq.com page and the rendered HTML is parsed instead — no stealth plugins, no proxies. If both fail, NASDAQ ships zero rows with a SOURCE_UNAVAILABLE note and the other exchanges still publish. Live result: nasdaqtrader.com answered with 12 rows; the Playwright fallback is tested on a saved page but was not needed live.</w:t>
+        <w:t>nasdaqtrader.com is tried first, with short timeouts. Its table is 'year | Holiday | Status'; a status containing a time is an early close at that local time. If it fails, headless Chromium opens the public nasdaq.com page and the rendered HTML is parsed instead. No stealth plugins, no proxies. If both fail, NASDAQ ships zero rows with a SOURCE_UNAVAILABLE note and the other exchanges still publish. Live result: nasdaqtrader.com answered with 12 rows; the Playwright fallback is tested on a saved page but was not needed live.</w:t>
       </w:r>
     </w:p>
     <w:p>
@@ -1621,7 +1823,7 @@
         <w:pStyle w:val="Heading3"/>
       </w:pPr>
       <w:r>
-        <w:t>CME — the step that deliberately does not fetch</w:t>
+        <w:t>CME: the step that deliberately does not fetch</w:t>
       </w:r>
     </w:p>
     <w:p>
@@ -1629,7 +1831,7 @@
         <w:rPr>
           <w:i w:val="0"/>
         </w:rPr>
-        <w:t>There is no single CME holiday calendar: equity index, rates, energy and agriculture differ, and Globex differs from ClearPort. The adapter is scoped to Globex US equity index products (ES, NQ, YM, RTY) and reads only files an operator has downloaded into input/cme/ — a CSV in a documented format or the per-holiday PDFs. The folder was empty, so CME returned zero rows with a MANUAL_INPUT_REQUIRED note. Scraping a site whose terms forbid it is not a trade-off I would make for a client-facing job.</w:t>
+        <w:t>There is no single CME holiday calendar: equity index, rates, energy and agriculture differ, and Globex differs from ClearPort. The adapter is scoped to Globex US equity index products (ES, NQ, YM, RTY) and reads only files an operator has downloaded into input/cme/: a CSV in a documented format or the per-holiday PDFs. The folder was empty, so CME returned zero rows with a MANUAL_INPUT_REQUIRED note. Scraping a site whose terms forbid it is not a trade-off I would make for a client-facing job.</w:t>
       </w:r>
     </w:p>
     <w:p>
@@ -1637,7 +1839,7 @@
         <w:pStyle w:val="Heading2"/>
       </w:pPr>
       <w:r>
-        <w:t>Step 4 — Normalise</w:t>
+        <w:t>Step 4: Normalise</w:t>
       </w:r>
     </w:p>
     <w:p>
@@ -1661,7 +1863,7 @@
         <w:pStyle w:val="ListBullet"/>
       </w:pPr>
       <w:r>
-        <w:t>Sort and drop duplicate (exchange, date, status) keys — none on this run.</w:t>
+        <w:t>Sort and drop duplicate (exchange, date, status) keys. There were none on this run.</w:t>
       </w:r>
     </w:p>
     <w:p>
@@ -1677,7 +1879,7 @@
         <w:pStyle w:val="Heading2"/>
       </w:pPr>
       <w:r>
-        <w:t>Step 5 — Validate, without auto-correcting</w:t>
+        <w:t>Step 5: Validate, without auto-correcting</w:t>
       </w:r>
     </w:p>
     <w:p>
@@ -1690,6 +1892,7 @@
     </w:p>
     <w:p>
       <w:pPr>
+        <w:keepNext/>
         <w:jc w:val="center"/>
       </w:pPr>
       <w:r>
@@ -1750,6 +1953,7 @@
     </w:p>
     <w:p>
       <w:pPr>
+        <w:keepNext/>
         <w:jc w:val="center"/>
       </w:pPr>
       <w:r>
@@ -1813,20 +2017,29 @@
         <w:tblStyle w:val="TableGrid"/>
         <w:tblW w:type="auto" w:w="0"/>
         <w:jc w:val="center"/>
+        <w:tblLayout w:type="fixed"/>
         <w:tblLook w:firstColumn="1" w:firstRow="1" w:lastColumn="0" w:lastRow="0" w:noHBand="0" w:noVBand="1" w:val="04A0"/>
+        <w:tblLayout w:type="fixed"/>
       </w:tblPr>
       <w:tblGrid>
-        <w:gridCol w:w="3137"/>
-        <w:gridCol w:w="3137"/>
-        <w:gridCol w:w="3137"/>
+        <w:gridCol w:w="2494"/>
+        <w:gridCol w:w="1020"/>
+        <w:gridCol w:w="5896"/>
       </w:tblGrid>
       <w:tr>
+        <w:trPr>
+          <w:cantSplit/>
+          <w:tblHeader/>
+        </w:trPr>
         <w:tc>
           <w:tcPr>
             <w:tcW w:type="dxa" w:w="2494"/>
             <w:shd w:val="clear" w:color="auto" w:fill="14213D"/>
           </w:tcPr>
           <w:p>
+            <w:pPr>
+              <w:keepNext/>
+            </w:pPr>
             <w:r/>
             <w:r>
               <w:rPr>
@@ -1844,6 +2057,9 @@
             <w:shd w:val="clear" w:color="auto" w:fill="14213D"/>
           </w:tcPr>
           <w:p>
+            <w:pPr>
+              <w:keepNext/>
+            </w:pPr>
             <w:r/>
             <w:r>
               <w:rPr>
@@ -1861,6 +2077,9 @@
             <w:shd w:val="clear" w:color="auto" w:fill="14213D"/>
           </w:tcPr>
           <w:p>
+            <w:pPr>
+              <w:keepNext/>
+            </w:pPr>
             <w:r/>
             <w:r>
               <w:rPr>
@@ -1874,11 +2093,17 @@
         </w:tc>
       </w:tr>
       <w:tr>
+        <w:trPr>
+          <w:cantSplit/>
+        </w:trPr>
         <w:tc>
           <w:tcPr>
             <w:tcW w:type="dxa" w:w="2494"/>
           </w:tcPr>
           <w:p>
+            <w:pPr>
+              <w:keepNext/>
+            </w:pPr>
             <w:r/>
             <w:r>
               <w:rPr>
@@ -1893,6 +2118,9 @@
             <w:tcW w:type="dxa" w:w="1020"/>
           </w:tcPr>
           <w:p>
+            <w:pPr>
+              <w:keepNext/>
+            </w:pPr>
             <w:r/>
             <w:r>
               <w:rPr>
@@ -1907,6 +2135,9 @@
             <w:tcW w:type="dxa" w:w="5896"/>
           </w:tcPr>
           <w:p>
+            <w:pPr>
+              <w:keepNext/>
+            </w:pPr>
             <w:r/>
             <w:r>
               <w:rPr>
@@ -1918,12 +2149,18 @@
         </w:tc>
       </w:tr>
       <w:tr>
+        <w:trPr>
+          <w:cantSplit/>
+        </w:trPr>
         <w:tc>
           <w:tcPr>
             <w:tcW w:type="dxa" w:w="2494"/>
             <w:shd w:val="clear" w:color="auto" w:fill="F4F6FA"/>
           </w:tcPr>
           <w:p>
+            <w:pPr>
+              <w:keepNext/>
+            </w:pPr>
             <w:r/>
             <w:r>
               <w:rPr>
@@ -1938,6 +2175,9 @@
             <w:tcW w:type="dxa" w:w="1020"/>
           </w:tcPr>
           <w:p>
+            <w:pPr>
+              <w:keepNext/>
+            </w:pPr>
             <w:r/>
             <w:r>
               <w:rPr>
@@ -1953,6 +2193,9 @@
             <w:shd w:val="clear" w:color="auto" w:fill="F4F6FA"/>
           </w:tcPr>
           <w:p>
+            <w:pPr>
+              <w:keepNext/>
+            </w:pPr>
             <w:r/>
             <w:r>
               <w:rPr>
@@ -1964,11 +2207,17 @@
         </w:tc>
       </w:tr>
       <w:tr>
+        <w:trPr>
+          <w:cantSplit/>
+        </w:trPr>
         <w:tc>
           <w:tcPr>
             <w:tcW w:type="dxa" w:w="2494"/>
           </w:tcPr>
           <w:p>
+            <w:pPr>
+              <w:keepNext/>
+            </w:pPr>
             <w:r/>
             <w:r>
               <w:rPr>
@@ -1983,6 +2232,9 @@
             <w:tcW w:type="dxa" w:w="1020"/>
           </w:tcPr>
           <w:p>
+            <w:pPr>
+              <w:keepNext/>
+            </w:pPr>
             <w:r/>
             <w:r>
               <w:rPr>
@@ -1997,6 +2249,9 @@
             <w:tcW w:type="dxa" w:w="5896"/>
           </w:tcPr>
           <w:p>
+            <w:pPr>
+              <w:keepNext/>
+            </w:pPr>
             <w:r/>
             <w:r>
               <w:rPr>
@@ -2008,12 +2263,18 @@
         </w:tc>
       </w:tr>
       <w:tr>
+        <w:trPr>
+          <w:cantSplit/>
+        </w:trPr>
         <w:tc>
           <w:tcPr>
             <w:tcW w:type="dxa" w:w="2494"/>
             <w:shd w:val="clear" w:color="auto" w:fill="F4F6FA"/>
           </w:tcPr>
           <w:p>
+            <w:pPr>
+              <w:keepNext/>
+            </w:pPr>
             <w:r/>
             <w:r>
               <w:rPr>
@@ -2028,6 +2289,9 @@
             <w:tcW w:type="dxa" w:w="1020"/>
           </w:tcPr>
           <w:p>
+            <w:pPr>
+              <w:keepNext/>
+            </w:pPr>
             <w:r/>
             <w:r>
               <w:rPr>
@@ -2043,6 +2307,9 @@
             <w:shd w:val="clear" w:color="auto" w:fill="F4F6FA"/>
           </w:tcPr>
           <w:p>
+            <w:pPr>
+              <w:keepNext/>
+            </w:pPr>
             <w:r/>
             <w:r>
               <w:rPr>
@@ -2054,11 +2321,17 @@
         </w:tc>
       </w:tr>
       <w:tr>
+        <w:trPr>
+          <w:cantSplit/>
+        </w:trPr>
         <w:tc>
           <w:tcPr>
             <w:tcW w:type="dxa" w:w="2494"/>
           </w:tcPr>
           <w:p>
+            <w:pPr>
+              <w:keepNext/>
+            </w:pPr>
             <w:r/>
             <w:r>
               <w:rPr>
@@ -2073,6 +2346,9 @@
             <w:tcW w:type="dxa" w:w="1020"/>
           </w:tcPr>
           <w:p>
+            <w:pPr>
+              <w:keepNext/>
+            </w:pPr>
             <w:r/>
             <w:r>
               <w:rPr>
@@ -2087,6 +2363,9 @@
             <w:tcW w:type="dxa" w:w="5896"/>
           </w:tcPr>
           <w:p>
+            <w:pPr>
+              <w:keepNext/>
+            </w:pPr>
             <w:r/>
             <w:r>
               <w:rPr>
@@ -2098,12 +2377,18 @@
         </w:tc>
       </w:tr>
       <w:tr>
+        <w:trPr>
+          <w:cantSplit/>
+        </w:trPr>
         <w:tc>
           <w:tcPr>
             <w:tcW w:type="dxa" w:w="2494"/>
             <w:shd w:val="clear" w:color="auto" w:fill="F4F6FA"/>
           </w:tcPr>
           <w:p>
+            <w:pPr>
+              <w:keepNext/>
+            </w:pPr>
             <w:r/>
             <w:r>
               <w:rPr>
@@ -2118,6 +2403,9 @@
             <w:tcW w:type="dxa" w:w="1020"/>
           </w:tcPr>
           <w:p>
+            <w:pPr>
+              <w:keepNext/>
+            </w:pPr>
             <w:r/>
             <w:r>
               <w:rPr>
@@ -2133,6 +2421,9 @@
             <w:shd w:val="clear" w:color="auto" w:fill="F4F6FA"/>
           </w:tcPr>
           <w:p>
+            <w:pPr>
+              <w:keepNext/>
+            </w:pPr>
             <w:r/>
             <w:r>
               <w:rPr>
@@ -2144,11 +2435,17 @@
         </w:tc>
       </w:tr>
       <w:tr>
+        <w:trPr>
+          <w:cantSplit/>
+        </w:trPr>
         <w:tc>
           <w:tcPr>
             <w:tcW w:type="dxa" w:w="2494"/>
           </w:tcPr>
           <w:p>
+            <w:pPr>
+              <w:keepNext/>
+            </w:pPr>
             <w:r/>
             <w:r>
               <w:rPr>
@@ -2163,6 +2460,9 @@
             <w:tcW w:type="dxa" w:w="1020"/>
           </w:tcPr>
           <w:p>
+            <w:pPr>
+              <w:keepNext/>
+            </w:pPr>
             <w:r/>
             <w:r>
               <w:rPr>
@@ -2177,6 +2477,9 @@
             <w:tcW w:type="dxa" w:w="5896"/>
           </w:tcPr>
           <w:p>
+            <w:pPr>
+              <w:keepNext/>
+            </w:pPr>
             <w:r/>
             <w:r>
               <w:rPr>
@@ -2188,12 +2491,18 @@
         </w:tc>
       </w:tr>
       <w:tr>
+        <w:trPr>
+          <w:cantSplit/>
+        </w:trPr>
         <w:tc>
           <w:tcPr>
             <w:tcW w:type="dxa" w:w="2494"/>
             <w:shd w:val="clear" w:color="auto" w:fill="F4F6FA"/>
           </w:tcPr>
           <w:p>
+            <w:pPr>
+              <w:keepNext/>
+            </w:pPr>
             <w:r/>
             <w:r>
               <w:rPr>
@@ -2208,6 +2517,9 @@
             <w:tcW w:type="dxa" w:w="1020"/>
           </w:tcPr>
           <w:p>
+            <w:pPr>
+              <w:keepNext/>
+            </w:pPr>
             <w:r/>
             <w:r>
               <w:rPr>
@@ -2223,6 +2535,9 @@
             <w:shd w:val="clear" w:color="auto" w:fill="F4F6FA"/>
           </w:tcPr>
           <w:p>
+            <w:pPr>
+              <w:keepNext/>
+            </w:pPr>
             <w:r/>
             <w:r>
               <w:rPr>
@@ -2234,11 +2549,17 @@
         </w:tc>
       </w:tr>
       <w:tr>
+        <w:trPr>
+          <w:cantSplit/>
+        </w:trPr>
         <w:tc>
           <w:tcPr>
             <w:tcW w:type="dxa" w:w="2494"/>
           </w:tcPr>
           <w:p>
+            <w:pPr>
+              <w:keepNext/>
+            </w:pPr>
             <w:r/>
             <w:r>
               <w:rPr>
@@ -2253,6 +2574,9 @@
             <w:tcW w:type="dxa" w:w="1020"/>
           </w:tcPr>
           <w:p>
+            <w:pPr>
+              <w:keepNext/>
+            </w:pPr>
             <w:r/>
             <w:r>
               <w:rPr>
@@ -2267,6 +2591,9 @@
             <w:tcW w:type="dxa" w:w="5896"/>
           </w:tcPr>
           <w:p>
+            <w:pPr>
+              <w:keepNext/>
+            </w:pPr>
             <w:r/>
             <w:r>
               <w:rPr>
@@ -2278,12 +2605,18 @@
         </w:tc>
       </w:tr>
       <w:tr>
+        <w:trPr>
+          <w:cantSplit/>
+        </w:trPr>
         <w:tc>
           <w:tcPr>
             <w:tcW w:type="dxa" w:w="2494"/>
             <w:shd w:val="clear" w:color="auto" w:fill="F4F6FA"/>
           </w:tcPr>
           <w:p>
+            <w:pPr>
+              <w:keepNext/>
+            </w:pPr>
             <w:r/>
             <w:r>
               <w:rPr>
@@ -2298,6 +2631,9 @@
             <w:tcW w:type="dxa" w:w="1020"/>
           </w:tcPr>
           <w:p>
+            <w:pPr>
+              <w:keepNext/>
+            </w:pPr>
             <w:r/>
             <w:r>
               <w:rPr>
@@ -2313,6 +2649,9 @@
             <w:shd w:val="clear" w:color="auto" w:fill="F4F6FA"/>
           </w:tcPr>
           <w:p>
+            <w:pPr>
+              <w:keepNext/>
+            </w:pPr>
             <w:r/>
             <w:r>
               <w:rPr>
@@ -2324,11 +2663,17 @@
         </w:tc>
       </w:tr>
       <w:tr>
+        <w:trPr>
+          <w:cantSplit/>
+        </w:trPr>
         <w:tc>
           <w:tcPr>
             <w:tcW w:type="dxa" w:w="2494"/>
           </w:tcPr>
           <w:p>
+            <w:pPr>
+              <w:keepNext/>
+            </w:pPr>
             <w:r/>
             <w:r>
               <w:rPr>
@@ -2343,6 +2688,9 @@
             <w:tcW w:type="dxa" w:w="1020"/>
           </w:tcPr>
           <w:p>
+            <w:pPr>
+              <w:keepNext/>
+            </w:pPr>
             <w:r/>
             <w:r>
               <w:rPr>
@@ -2357,6 +2705,9 @@
             <w:tcW w:type="dxa" w:w="5896"/>
           </w:tcPr>
           <w:p>
+            <w:pPr>
+              <w:keepNext/>
+            </w:pPr>
             <w:r/>
             <w:r>
               <w:rPr>
@@ -2368,12 +2719,18 @@
         </w:tc>
       </w:tr>
       <w:tr>
+        <w:trPr>
+          <w:cantSplit/>
+        </w:trPr>
         <w:tc>
           <w:tcPr>
             <w:tcW w:type="dxa" w:w="2494"/>
             <w:shd w:val="clear" w:color="auto" w:fill="F4F6FA"/>
           </w:tcPr>
           <w:p>
+            <w:pPr>
+              <w:keepNext/>
+            </w:pPr>
             <w:r/>
             <w:r>
               <w:rPr>
@@ -2388,6 +2745,9 @@
             <w:tcW w:type="dxa" w:w="1020"/>
           </w:tcPr>
           <w:p>
+            <w:pPr>
+              <w:keepNext/>
+            </w:pPr>
             <w:r/>
             <w:r>
               <w:rPr>
@@ -2403,6 +2763,9 @@
             <w:shd w:val="clear" w:color="auto" w:fill="F4F6FA"/>
           </w:tcPr>
           <w:p>
+            <w:pPr>
+              <w:keepNext/>
+            </w:pPr>
             <w:r/>
             <w:r>
               <w:rPr>
@@ -2414,11 +2777,17 @@
         </w:tc>
       </w:tr>
       <w:tr>
+        <w:trPr>
+          <w:cantSplit/>
+        </w:trPr>
         <w:tc>
           <w:tcPr>
             <w:tcW w:type="dxa" w:w="2494"/>
           </w:tcPr>
           <w:p>
+            <w:pPr>
+              <w:keepNext/>
+            </w:pPr>
             <w:r/>
             <w:r>
               <w:rPr>
@@ -2433,6 +2802,9 @@
             <w:tcW w:type="dxa" w:w="1020"/>
           </w:tcPr>
           <w:p>
+            <w:pPr>
+              <w:keepNext/>
+            </w:pPr>
             <w:r/>
             <w:r>
               <w:rPr>
@@ -2447,6 +2819,9 @@
             <w:tcW w:type="dxa" w:w="5896"/>
           </w:tcPr>
           <w:p>
+            <w:pPr>
+              <w:keepNext/>
+            </w:pPr>
             <w:r/>
             <w:r>
               <w:rPr>
@@ -2458,12 +2833,18 @@
         </w:tc>
       </w:tr>
       <w:tr>
+        <w:trPr>
+          <w:cantSplit/>
+        </w:trPr>
         <w:tc>
           <w:tcPr>
             <w:tcW w:type="dxa" w:w="2494"/>
             <w:shd w:val="clear" w:color="auto" w:fill="F4F6FA"/>
           </w:tcPr>
           <w:p>
+            <w:pPr>
+              <w:keepNext/>
+            </w:pPr>
             <w:r/>
             <w:r>
               <w:rPr>
@@ -2478,6 +2859,9 @@
             <w:tcW w:type="dxa" w:w="1020"/>
           </w:tcPr>
           <w:p>
+            <w:pPr>
+              <w:keepNext/>
+            </w:pPr>
             <w:r/>
             <w:r>
               <w:rPr>
@@ -2493,6 +2877,9 @@
             <w:shd w:val="clear" w:color="auto" w:fill="F4F6FA"/>
           </w:tcPr>
           <w:p>
+            <w:pPr>
+              <w:keepNext/>
+            </w:pPr>
             <w:r/>
             <w:r>
               <w:rPr>
@@ -2504,11 +2891,17 @@
         </w:tc>
       </w:tr>
       <w:tr>
+        <w:trPr>
+          <w:cantSplit/>
+        </w:trPr>
         <w:tc>
           <w:tcPr>
             <w:tcW w:type="dxa" w:w="2494"/>
           </w:tcPr>
           <w:p>
+            <w:pPr>
+              <w:keepNext/>
+            </w:pPr>
             <w:r/>
             <w:r>
               <w:rPr>
@@ -2523,6 +2916,9 @@
             <w:tcW w:type="dxa" w:w="1020"/>
           </w:tcPr>
           <w:p>
+            <w:pPr>
+              <w:keepNext/>
+            </w:pPr>
             <w:r/>
             <w:r>
               <w:rPr>
@@ -2537,6 +2933,9 @@
             <w:tcW w:type="dxa" w:w="5896"/>
           </w:tcPr>
           <w:p>
+            <w:pPr>
+              <w:keepNext/>
+            </w:pPr>
             <w:r/>
             <w:r>
               <w:rPr>
@@ -2548,12 +2947,18 @@
         </w:tc>
       </w:tr>
       <w:tr>
+        <w:trPr>
+          <w:cantSplit/>
+        </w:trPr>
         <w:tc>
           <w:tcPr>
             <w:tcW w:type="dxa" w:w="2494"/>
             <w:shd w:val="clear" w:color="auto" w:fill="F4F6FA"/>
           </w:tcPr>
           <w:p>
+            <w:pPr>
+              <w:keepNext/>
+            </w:pPr>
             <w:r/>
             <w:r>
               <w:rPr>
@@ -2568,6 +2973,9 @@
             <w:tcW w:type="dxa" w:w="1020"/>
           </w:tcPr>
           <w:p>
+            <w:pPr>
+              <w:keepNext/>
+            </w:pPr>
             <w:r/>
             <w:r>
               <w:rPr>
@@ -2583,6 +2991,9 @@
             <w:shd w:val="clear" w:color="auto" w:fill="F4F6FA"/>
           </w:tcPr>
           <w:p>
+            <w:pPr>
+              <w:keepNext/>
+            </w:pPr>
             <w:r/>
             <w:r>
               <w:rPr>
@@ -2594,11 +3005,17 @@
         </w:tc>
       </w:tr>
       <w:tr>
+        <w:trPr>
+          <w:cantSplit/>
+        </w:trPr>
         <w:tc>
           <w:tcPr>
             <w:tcW w:type="dxa" w:w="2494"/>
           </w:tcPr>
           <w:p>
+            <w:pPr>
+              <w:keepNext/>
+            </w:pPr>
             <w:r/>
             <w:r>
               <w:rPr>
@@ -2613,6 +3030,9 @@
             <w:tcW w:type="dxa" w:w="1020"/>
           </w:tcPr>
           <w:p>
+            <w:pPr>
+              <w:keepNext/>
+            </w:pPr>
             <w:r/>
             <w:r>
               <w:rPr>
@@ -2627,6 +3047,9 @@
             <w:tcW w:type="dxa" w:w="5896"/>
           </w:tcPr>
           <w:p>
+            <w:pPr>
+              <w:keepNext/>
+            </w:pPr>
             <w:r/>
             <w:r>
               <w:rPr>
@@ -2638,12 +3061,18 @@
         </w:tc>
       </w:tr>
       <w:tr>
+        <w:trPr>
+          <w:cantSplit/>
+        </w:trPr>
         <w:tc>
           <w:tcPr>
             <w:tcW w:type="dxa" w:w="2494"/>
             <w:shd w:val="clear" w:color="auto" w:fill="F4F6FA"/>
           </w:tcPr>
           <w:p>
+            <w:pPr>
+              <w:keepNext/>
+            </w:pPr>
             <w:r/>
             <w:r>
               <w:rPr>
@@ -2658,6 +3087,9 @@
             <w:tcW w:type="dxa" w:w="1020"/>
           </w:tcPr>
           <w:p>
+            <w:pPr>
+              <w:keepNext/>
+            </w:pPr>
             <w:r/>
             <w:r>
               <w:rPr>
@@ -2673,6 +3105,9 @@
             <w:shd w:val="clear" w:color="auto" w:fill="F4F6FA"/>
           </w:tcPr>
           <w:p>
+            <w:pPr>
+              <w:keepNext/>
+            </w:pPr>
             <w:r/>
             <w:r>
               <w:rPr>
@@ -2684,6 +3119,9 @@
         </w:tc>
       </w:tr>
       <w:tr>
+        <w:trPr>
+          <w:cantSplit/>
+        </w:trPr>
         <w:tc>
           <w:tcPr>
             <w:tcW w:type="dxa" w:w="2494"/>
@@ -2748,20 +3186,29 @@
         <w:tblStyle w:val="TableGrid"/>
         <w:tblW w:type="auto" w:w="0"/>
         <w:jc w:val="center"/>
+        <w:tblLayout w:type="fixed"/>
         <w:tblLook w:firstColumn="1" w:firstRow="1" w:lastColumn="0" w:lastRow="0" w:noHBand="0" w:noVBand="1" w:val="04A0"/>
+        <w:tblLayout w:type="fixed"/>
       </w:tblPr>
       <w:tblGrid>
-        <w:gridCol w:w="3137"/>
-        <w:gridCol w:w="3137"/>
-        <w:gridCol w:w="3137"/>
+        <w:gridCol w:w="2494"/>
+        <w:gridCol w:w="1020"/>
+        <w:gridCol w:w="5896"/>
       </w:tblGrid>
       <w:tr>
+        <w:trPr>
+          <w:cantSplit/>
+          <w:tblHeader/>
+        </w:trPr>
         <w:tc>
           <w:tcPr>
             <w:tcW w:type="dxa" w:w="2494"/>
             <w:shd w:val="clear" w:color="auto" w:fill="14213D"/>
           </w:tcPr>
           <w:p>
+            <w:pPr>
+              <w:keepNext/>
+            </w:pPr>
             <w:r/>
             <w:r>
               <w:rPr>
@@ -2779,6 +3226,9 @@
             <w:shd w:val="clear" w:color="auto" w:fill="14213D"/>
           </w:tcPr>
           <w:p>
+            <w:pPr>
+              <w:keepNext/>
+            </w:pPr>
             <w:r/>
             <w:r>
               <w:rPr>
@@ -2796,6 +3246,9 @@
             <w:shd w:val="clear" w:color="auto" w:fill="14213D"/>
           </w:tcPr>
           <w:p>
+            <w:pPr>
+              <w:keepNext/>
+            </w:pPr>
             <w:r/>
             <w:r>
               <w:rPr>
@@ -2809,11 +3262,17 @@
         </w:tc>
       </w:tr>
       <w:tr>
+        <w:trPr>
+          <w:cantSplit/>
+        </w:trPr>
         <w:tc>
           <w:tcPr>
             <w:tcW w:type="dxa" w:w="2494"/>
           </w:tcPr>
           <w:p>
+            <w:pPr>
+              <w:keepNext/>
+            </w:pPr>
             <w:r/>
             <w:r>
               <w:rPr>
@@ -2828,6 +3287,9 @@
             <w:tcW w:type="dxa" w:w="1020"/>
           </w:tcPr>
           <w:p>
+            <w:pPr>
+              <w:keepNext/>
+            </w:pPr>
             <w:r/>
             <w:r>
               <w:rPr>
@@ -2842,6 +3304,9 @@
             <w:tcW w:type="dxa" w:w="5896"/>
           </w:tcPr>
           <w:p>
+            <w:pPr>
+              <w:keepNext/>
+            </w:pPr>
             <w:r/>
             <w:r>
               <w:rPr>
@@ -2853,12 +3318,18 @@
         </w:tc>
       </w:tr>
       <w:tr>
+        <w:trPr>
+          <w:cantSplit/>
+        </w:trPr>
         <w:tc>
           <w:tcPr>
             <w:tcW w:type="dxa" w:w="2494"/>
             <w:shd w:val="clear" w:color="auto" w:fill="F4F6FA"/>
           </w:tcPr>
           <w:p>
+            <w:pPr>
+              <w:keepNext/>
+            </w:pPr>
             <w:r/>
             <w:r>
               <w:rPr>
@@ -2873,6 +3344,9 @@
             <w:tcW w:type="dxa" w:w="1020"/>
           </w:tcPr>
           <w:p>
+            <w:pPr>
+              <w:keepNext/>
+            </w:pPr>
             <w:r/>
             <w:r>
               <w:rPr>
@@ -2888,6 +3362,9 @@
             <w:shd w:val="clear" w:color="auto" w:fill="F4F6FA"/>
           </w:tcPr>
           <w:p>
+            <w:pPr>
+              <w:keepNext/>
+            </w:pPr>
             <w:r/>
             <w:r>
               <w:rPr>
@@ -2899,11 +3376,17 @@
         </w:tc>
       </w:tr>
       <w:tr>
+        <w:trPr>
+          <w:cantSplit/>
+        </w:trPr>
         <w:tc>
           <w:tcPr>
             <w:tcW w:type="dxa" w:w="2494"/>
           </w:tcPr>
           <w:p>
+            <w:pPr>
+              <w:keepNext/>
+            </w:pPr>
             <w:r/>
             <w:r>
               <w:rPr>
@@ -2918,6 +3401,9 @@
             <w:tcW w:type="dxa" w:w="1020"/>
           </w:tcPr>
           <w:p>
+            <w:pPr>
+              <w:keepNext/>
+            </w:pPr>
             <w:r/>
             <w:r>
               <w:rPr>
@@ -2932,6 +3418,9 @@
             <w:tcW w:type="dxa" w:w="5896"/>
           </w:tcPr>
           <w:p>
+            <w:pPr>
+              <w:keepNext/>
+            </w:pPr>
             <w:r/>
             <w:r>
               <w:rPr>
@@ -2943,6 +3432,9 @@
         </w:tc>
       </w:tr>
       <w:tr>
+        <w:trPr>
+          <w:cantSplit/>
+        </w:trPr>
         <w:tc>
           <w:tcPr>
             <w:tcW w:type="dxa" w:w="2494"/>
@@ -2995,7 +3487,7 @@
         <w:pStyle w:val="Heading2"/>
       </w:pPr>
       <w:r>
-        <w:t>Step 6 — Write the files and exit with a meaningful code</w:t>
+        <w:t>Step 6: Write the files and exit with a meaningful code</w:t>
       </w:r>
     </w:p>
     <w:p>
@@ -3003,12 +3495,7 @@
         <w:rPr>
           <w:i w:val="0"/>
         </w:rPr>
-        <w:t>The combined CSV and one CSV per exchange that returned rows are written (CME has no file because it has no rows), plus validation_report.md, validation_checks.json and run_meta.json. Before overwriting, the previous combined file is copied aside so the next run can diff against it; a change of more than 30 % of rows is a FAIL. Exit code 0 means PASS or WARN, 1 means validation FAIL, 2 means an adapter crashed — and the automation treats those differently.</w:t>
-      </w:r>
-    </w:p>
-    <w:p>
-      <w:r>
-        <w:br w:type="page"/>
+        <w:t>The combined CSV and one CSV per exchange that returned rows are written (CME has no file because it has no rows), plus validation_report.md, validation_checks.json and run_meta.json. Before overwriting, the previous combined file is copied aside so the next run can diff against it; a change of more than 30 % of rows is a FAIL. Exit code 0 means PASS or WARN, 1 means validation FAIL, 2 means an adapter crashed, and the automation treats those differently.</w:t>
       </w:r>
     </w:p>
     <w:p>
@@ -3029,8 +3516,19 @@
     </w:p>
     <w:p>
       <w:pPr>
-        <w:pStyle w:val="ListNumber"/>
+        <w:tabs>
+          <w:tab w:pos="425" w:val="left"/>
+        </w:tabs>
+        <w:ind w:left="425" w:hanging="425"/>
       </w:pPr>
+      <w:r>
+        <w:rPr>
+          <w:b/>
+          <w:color w:val="0F8B8D"/>
+        </w:rPr>
+        <w:t>1.</w:t>
+        <w:tab/>
+      </w:r>
       <w:r>
         <w:rPr>
           <w:b/>
@@ -3043,8 +3541,19 @@
     </w:p>
     <w:p>
       <w:pPr>
-        <w:pStyle w:val="ListNumber"/>
+        <w:tabs>
+          <w:tab w:pos="425" w:val="left"/>
+        </w:tabs>
+        <w:ind w:left="425" w:hanging="425"/>
       </w:pPr>
+      <w:r>
+        <w:rPr>
+          <w:b/>
+          <w:color w:val="0F8B8D"/>
+        </w:rPr>
+        <w:t>2.</w:t>
+        <w:tab/>
+      </w:r>
       <w:r>
         <w:rPr>
           <w:b/>
@@ -3057,8 +3566,19 @@
     </w:p>
     <w:p>
       <w:pPr>
-        <w:pStyle w:val="ListNumber"/>
+        <w:tabs>
+          <w:tab w:pos="425" w:val="left"/>
+        </w:tabs>
+        <w:ind w:left="425" w:hanging="425"/>
       </w:pPr>
+      <w:r>
+        <w:rPr>
+          <w:b/>
+          <w:color w:val="0F8B8D"/>
+        </w:rPr>
+        <w:t>3.</w:t>
+        <w:tab/>
+      </w:r>
       <w:r>
         <w:rPr>
           <w:b/>
@@ -3066,13 +3586,24 @@
         <w:t xml:space="preserve">Tests first. </w:t>
       </w:r>
       <w:r>
-        <w:t>python -m pytest tests -q — 11 tests on saved fixtures, no network.</w:t>
+        <w:t>python -m pytest tests -q runs 11 tests on saved fixtures, no network.</w:t>
       </w:r>
     </w:p>
     <w:p>
       <w:pPr>
-        <w:pStyle w:val="ListNumber"/>
+        <w:tabs>
+          <w:tab w:pos="425" w:val="left"/>
+        </w:tabs>
+        <w:ind w:left="425" w:hanging="425"/>
       </w:pPr>
+      <w:r>
+        <w:rPr>
+          <w:b/>
+          <w:color w:val="0F8B8D"/>
+        </w:rPr>
+        <w:t>4.</w:t>
+        <w:tab/>
+      </w:r>
       <w:r>
         <w:rPr>
           <w:b/>
@@ -3085,8 +3616,19 @@
     </w:p>
     <w:p>
       <w:pPr>
-        <w:pStyle w:val="ListNumber"/>
+        <w:tabs>
+          <w:tab w:pos="425" w:val="left"/>
+        </w:tabs>
+        <w:ind w:left="425" w:hanging="425"/>
       </w:pPr>
+      <w:r>
+        <w:rPr>
+          <w:b/>
+          <w:color w:val="0F8B8D"/>
+        </w:rPr>
+        <w:t>5.</w:t>
+        <w:tab/>
+      </w:r>
       <w:r>
         <w:rPr>
           <w:b/>
@@ -3099,8 +3641,19 @@
     </w:p>
     <w:p>
       <w:pPr>
-        <w:pStyle w:val="ListNumber"/>
+        <w:tabs>
+          <w:tab w:pos="425" w:val="left"/>
+        </w:tabs>
+        <w:ind w:left="425" w:hanging="425"/>
       </w:pPr>
+      <w:r>
+        <w:rPr>
+          <w:b/>
+          <w:color w:val="0F8B8D"/>
+        </w:rPr>
+        <w:t>6.</w:t>
+        <w:tab/>
+      </w:r>
       <w:r>
         <w:rPr>
           <w:b/>
@@ -3113,8 +3666,19 @@
     </w:p>
     <w:p>
       <w:pPr>
-        <w:pStyle w:val="ListNumber"/>
+        <w:tabs>
+          <w:tab w:pos="425" w:val="left"/>
+        </w:tabs>
+        <w:ind w:left="425" w:hanging="425"/>
       </w:pPr>
+      <w:r>
+        <w:rPr>
+          <w:b/>
+          <w:color w:val="0F8B8D"/>
+        </w:rPr>
+        <w:t>7.</w:t>
+        <w:tab/>
+      </w:r>
       <w:r>
         <w:rPr>
           <w:b/>
@@ -3130,20 +3694,29 @@
         <w:tblStyle w:val="TableGrid"/>
         <w:tblW w:type="auto" w:w="0"/>
         <w:jc w:val="center"/>
+        <w:tblLayout w:type="fixed"/>
         <w:tblLook w:firstColumn="1" w:firstRow="1" w:lastColumn="0" w:lastRow="0" w:noHBand="0" w:noVBand="1" w:val="04A0"/>
+        <w:tblLayout w:type="fixed"/>
       </w:tblPr>
       <w:tblGrid>
-        <w:gridCol w:w="3137"/>
-        <w:gridCol w:w="3137"/>
-        <w:gridCol w:w="3137"/>
+        <w:gridCol w:w="3175"/>
+        <w:gridCol w:w="4309"/>
+        <w:gridCol w:w="1928"/>
       </w:tblGrid>
       <w:tr>
+        <w:trPr>
+          <w:cantSplit/>
+          <w:tblHeader/>
+        </w:trPr>
         <w:tc>
           <w:tcPr>
             <w:tcW w:type="dxa" w:w="3175"/>
             <w:shd w:val="clear" w:color="auto" w:fill="14213D"/>
           </w:tcPr>
           <w:p>
+            <w:pPr>
+              <w:keepNext/>
+            </w:pPr>
             <w:r/>
             <w:r>
               <w:rPr>
@@ -3161,6 +3734,9 @@
             <w:shd w:val="clear" w:color="auto" w:fill="14213D"/>
           </w:tcPr>
           <w:p>
+            <w:pPr>
+              <w:keepNext/>
+            </w:pPr>
             <w:r/>
             <w:r>
               <w:rPr>
@@ -3178,6 +3754,9 @@
             <w:shd w:val="clear" w:color="auto" w:fill="14213D"/>
           </w:tcPr>
           <w:p>
+            <w:pPr>
+              <w:keepNext/>
+            </w:pPr>
             <w:r/>
             <w:r>
               <w:rPr>
@@ -3191,11 +3770,17 @@
         </w:tc>
       </w:tr>
       <w:tr>
+        <w:trPr>
+          <w:cantSplit/>
+        </w:trPr>
         <w:tc>
           <w:tcPr>
             <w:tcW w:type="dxa" w:w="3175"/>
           </w:tcPr>
           <w:p>
+            <w:pPr>
+              <w:keepNext/>
+            </w:pPr>
             <w:r/>
             <w:r>
               <w:rPr>
@@ -3210,6 +3795,9 @@
             <w:tcW w:type="dxa" w:w="4309"/>
           </w:tcPr>
           <w:p>
+            <w:pPr>
+              <w:keepNext/>
+            </w:pPr>
             <w:r/>
             <w:r>
               <w:rPr>
@@ -3224,6 +3812,9 @@
             <w:tcW w:type="dxa" w:w="1928"/>
           </w:tcPr>
           <w:p>
+            <w:pPr>
+              <w:keepNext/>
+            </w:pPr>
             <w:r/>
             <w:r>
               <w:rPr>
@@ -3235,12 +3826,18 @@
         </w:tc>
       </w:tr>
       <w:tr>
+        <w:trPr>
+          <w:cantSplit/>
+        </w:trPr>
         <w:tc>
           <w:tcPr>
             <w:tcW w:type="dxa" w:w="3175"/>
             <w:shd w:val="clear" w:color="auto" w:fill="F4F6FA"/>
           </w:tcPr>
           <w:p>
+            <w:pPr>
+              <w:keepNext/>
+            </w:pPr>
             <w:r/>
             <w:r>
               <w:rPr>
@@ -3256,6 +3853,9 @@
             <w:shd w:val="clear" w:color="auto" w:fill="F4F6FA"/>
           </w:tcPr>
           <w:p>
+            <w:pPr>
+              <w:keepNext/>
+            </w:pPr>
             <w:r/>
             <w:r>
               <w:rPr>
@@ -3271,6 +3871,9 @@
             <w:shd w:val="clear" w:color="auto" w:fill="F4F6FA"/>
           </w:tcPr>
           <w:p>
+            <w:pPr>
+              <w:keepNext/>
+            </w:pPr>
             <w:r/>
             <w:r>
               <w:rPr>
@@ -3282,11 +3885,17 @@
         </w:tc>
       </w:tr>
       <w:tr>
+        <w:trPr>
+          <w:cantSplit/>
+        </w:trPr>
         <w:tc>
           <w:tcPr>
             <w:tcW w:type="dxa" w:w="3175"/>
           </w:tcPr>
           <w:p>
+            <w:pPr>
+              <w:keepNext/>
+            </w:pPr>
             <w:r/>
             <w:r>
               <w:rPr>
@@ -3301,6 +3910,9 @@
             <w:tcW w:type="dxa" w:w="4309"/>
           </w:tcPr>
           <w:p>
+            <w:pPr>
+              <w:keepNext/>
+            </w:pPr>
             <w:r/>
             <w:r>
               <w:rPr>
@@ -3315,6 +3927,9 @@
             <w:tcW w:type="dxa" w:w="1928"/>
           </w:tcPr>
           <w:p>
+            <w:pPr>
+              <w:keepNext/>
+            </w:pPr>
             <w:r/>
             <w:r>
               <w:rPr>
@@ -3326,6 +3941,9 @@
         </w:tc>
       </w:tr>
       <w:tr>
+        <w:trPr>
+          <w:cantSplit/>
+        </w:trPr>
         <w:tc>
           <w:tcPr>
             <w:tcW w:type="dxa" w:w="3175"/>
@@ -3378,15 +3996,20 @@
       <w:tblPr>
         <w:tblW w:type="auto" w:w="0"/>
         <w:jc w:val="center"/>
+        <w:tblLayout w:type="fixed"/>
         <w:tblLook w:firstColumn="1" w:firstRow="1" w:lastColumn="0" w:lastRow="0" w:noHBand="0" w:noVBand="1" w:val="04A0"/>
+        <w:tblLayout w:type="fixed"/>
       </w:tblPr>
       <w:tblGrid>
-        <w:gridCol w:w="9412"/>
+        <w:gridCol w:w="9411"/>
       </w:tblGrid>
       <w:tr>
+        <w:trPr>
+          <w:cantSplit/>
+        </w:trPr>
         <w:tc>
           <w:tcPr>
-            <w:tcW w:type="dxa" w:w="9412"/>
+            <w:tcW w:type="dxa" w:w="9411"/>
             <w:shd w:val="clear" w:color="auto" w:fill="14213D"/>
             <w:tcMar>
               <w:top w:w="198" w:type="dxa"/>
@@ -3431,20 +4054,29 @@
         <w:tblStyle w:val="TableGrid"/>
         <w:tblW w:type="auto" w:w="0"/>
         <w:jc w:val="center"/>
+        <w:tblLayout w:type="fixed"/>
         <w:tblLook w:firstColumn="1" w:firstRow="1" w:lastColumn="0" w:lastRow="0" w:noHBand="0" w:noVBand="1" w:val="04A0"/>
+        <w:tblLayout w:type="fixed"/>
       </w:tblPr>
       <w:tblGrid>
-        <w:gridCol w:w="3137"/>
-        <w:gridCol w:w="3137"/>
-        <w:gridCol w:w="3137"/>
+        <w:gridCol w:w="2948"/>
+        <w:gridCol w:w="1361"/>
+        <w:gridCol w:w="5102"/>
       </w:tblGrid>
       <w:tr>
+        <w:trPr>
+          <w:cantSplit/>
+          <w:tblHeader/>
+        </w:trPr>
         <w:tc>
           <w:tcPr>
             <w:tcW w:type="dxa" w:w="2948"/>
             <w:shd w:val="clear" w:color="auto" w:fill="14213D"/>
           </w:tcPr>
           <w:p>
+            <w:pPr>
+              <w:keepNext/>
+            </w:pPr>
             <w:r/>
             <w:r>
               <w:rPr>
@@ -3462,6 +4094,9 @@
             <w:shd w:val="clear" w:color="auto" w:fill="14213D"/>
           </w:tcPr>
           <w:p>
+            <w:pPr>
+              <w:keepNext/>
+            </w:pPr>
             <w:r/>
             <w:r>
               <w:rPr>
@@ -3479,6 +4114,9 @@
             <w:shd w:val="clear" w:color="auto" w:fill="14213D"/>
           </w:tcPr>
           <w:p>
+            <w:pPr>
+              <w:keepNext/>
+            </w:pPr>
             <w:r/>
             <w:r>
               <w:rPr>
@@ -3492,11 +4130,17 @@
         </w:tc>
       </w:tr>
       <w:tr>
+        <w:trPr>
+          <w:cantSplit/>
+        </w:trPr>
         <w:tc>
           <w:tcPr>
             <w:tcW w:type="dxa" w:w="2948"/>
           </w:tcPr>
           <w:p>
+            <w:pPr>
+              <w:keepNext/>
+            </w:pPr>
             <w:r/>
             <w:r>
               <w:rPr>
@@ -3512,6 +4156,9 @@
             <w:shd w:val="clear" w:color="auto" w:fill="E9A23B"/>
           </w:tcPr>
           <w:p>
+            <w:pPr>
+              <w:keepNext/>
+            </w:pPr>
             <w:r/>
             <w:r>
               <w:rPr>
@@ -3528,6 +4175,9 @@
             <w:tcW w:type="dxa" w:w="5102"/>
           </w:tcPr>
           <w:p>
+            <w:pPr>
+              <w:keepNext/>
+            </w:pPr>
             <w:r/>
             <w:r>
               <w:rPr>
@@ -3539,12 +4189,18 @@
         </w:tc>
       </w:tr>
       <w:tr>
+        <w:trPr>
+          <w:cantSplit/>
+        </w:trPr>
         <w:tc>
           <w:tcPr>
             <w:tcW w:type="dxa" w:w="2948"/>
             <w:shd w:val="clear" w:color="auto" w:fill="F4F6FA"/>
           </w:tcPr>
           <w:p>
+            <w:pPr>
+              <w:keepNext/>
+            </w:pPr>
             <w:r/>
             <w:r>
               <w:rPr>
@@ -3560,6 +4216,9 @@
             <w:shd w:val="clear" w:color="auto" w:fill="E76F51"/>
           </w:tcPr>
           <w:p>
+            <w:pPr>
+              <w:keepNext/>
+            </w:pPr>
             <w:r/>
             <w:r>
               <w:rPr>
@@ -3577,6 +4236,9 @@
             <w:shd w:val="clear" w:color="auto" w:fill="F4F6FA"/>
           </w:tcPr>
           <w:p>
+            <w:pPr>
+              <w:keepNext/>
+            </w:pPr>
             <w:r/>
             <w:r>
               <w:rPr>
@@ -3588,11 +4250,17 @@
         </w:tc>
       </w:tr>
       <w:tr>
+        <w:trPr>
+          <w:cantSplit/>
+        </w:trPr>
         <w:tc>
           <w:tcPr>
             <w:tcW w:type="dxa" w:w="2948"/>
           </w:tcPr>
           <w:p>
+            <w:pPr>
+              <w:keepNext/>
+            </w:pPr>
             <w:r/>
             <w:r>
               <w:rPr>
@@ -3608,6 +4276,9 @@
             <w:shd w:val="clear" w:color="auto" w:fill="E76F51"/>
           </w:tcPr>
           <w:p>
+            <w:pPr>
+              <w:keepNext/>
+            </w:pPr>
             <w:r/>
             <w:r>
               <w:rPr>
@@ -3624,6 +4295,9 @@
             <w:tcW w:type="dxa" w:w="5102"/>
           </w:tcPr>
           <w:p>
+            <w:pPr>
+              <w:keepNext/>
+            </w:pPr>
             <w:r/>
             <w:r>
               <w:rPr>
@@ -3635,12 +4309,18 @@
         </w:tc>
       </w:tr>
       <w:tr>
+        <w:trPr>
+          <w:cantSplit/>
+        </w:trPr>
         <w:tc>
           <w:tcPr>
             <w:tcW w:type="dxa" w:w="2948"/>
             <w:shd w:val="clear" w:color="auto" w:fill="F4F6FA"/>
           </w:tcPr>
           <w:p>
+            <w:pPr>
+              <w:keepNext/>
+            </w:pPr>
             <w:r/>
             <w:r>
               <w:rPr>
@@ -3656,6 +4336,9 @@
             <w:shd w:val="clear" w:color="auto" w:fill="E9A23B"/>
           </w:tcPr>
           <w:p>
+            <w:pPr>
+              <w:keepNext/>
+            </w:pPr>
             <w:r/>
             <w:r>
               <w:rPr>
@@ -3673,6 +4356,9 @@
             <w:shd w:val="clear" w:color="auto" w:fill="F4F6FA"/>
           </w:tcPr>
           <w:p>
+            <w:pPr>
+              <w:keepNext/>
+            </w:pPr>
             <w:r/>
             <w:r>
               <w:rPr>
@@ -3684,6 +4370,9 @@
         </w:tc>
       </w:tr>
       <w:tr>
+        <w:trPr>
+          <w:cantSplit/>
+        </w:trPr>
         <w:tc>
           <w:tcPr>
             <w:tcW w:type="dxa" w:w="2948"/>
@@ -3742,40 +4431,95 @@
     </w:p>
     <w:p>
       <w:pPr>
-        <w:pStyle w:val="ListNumber"/>
+        <w:tabs>
+          <w:tab w:pos="425" w:val="left"/>
+        </w:tabs>
+        <w:ind w:left="425" w:hanging="425"/>
       </w:pPr>
+      <w:r>
+        <w:rPr>
+          <w:b/>
+          <w:color w:val="0F8B8D"/>
+        </w:rPr>
+        <w:t>1.</w:t>
+        <w:tab/>
+      </w:r>
       <w:r>
         <w:t>Create scraper/adapters/&lt;name&gt;.py with the exchange, time zone, source URL and scope, implementing scrape() and parse().</w:t>
       </w:r>
     </w:p>
     <w:p>
       <w:pPr>
-        <w:pStyle w:val="ListNumber"/>
+        <w:tabs>
+          <w:tab w:pos="425" w:val="left"/>
+        </w:tabs>
+        <w:ind w:left="425" w:hanging="425"/>
       </w:pPr>
+      <w:r>
+        <w:rPr>
+          <w:b/>
+          <w:color w:val="0F8B8D"/>
+        </w:rPr>
+        <w:t>2.</w:t>
+        <w:tab/>
+      </w:r>
       <w:r>
         <w:t>Use self.fetch so raw bodies are kept, and self.row(...) so the schema stays aligned.</w:t>
       </w:r>
     </w:p>
     <w:p>
       <w:pPr>
-        <w:pStyle w:val="ListNumber"/>
+        <w:tabs>
+          <w:tab w:pos="425" w:val="left"/>
+        </w:tabs>
+        <w:ind w:left="425" w:hanging="425"/>
       </w:pPr>
+      <w:r>
+        <w:rPr>
+          <w:b/>
+          <w:color w:val="0F8B8D"/>
+        </w:rPr>
+        <w:t>3.</w:t>
+        <w:tab/>
+      </w:r>
       <w:r>
         <w:t>Register it in scraper/adapters/__init__.py and give it a plausible closure band in validate.PLAUSIBLE_CLOSURES.</w:t>
       </w:r>
     </w:p>
     <w:p>
       <w:pPr>
-        <w:pStyle w:val="ListNumber"/>
+        <w:tabs>
+          <w:tab w:pos="425" w:val="left"/>
+        </w:tabs>
+        <w:ind w:left="425" w:hanging="425"/>
       </w:pPr>
+      <w:r>
+        <w:rPr>
+          <w:b/>
+          <w:color w:val="0F8B8D"/>
+        </w:rPr>
+        <w:t>4.</w:t>
+        <w:tab/>
+      </w:r>
       <w:r>
         <w:t>Save a fixture under tests/fixtures/ and add an offline parser test.</w:t>
       </w:r>
     </w:p>
     <w:p>
       <w:pPr>
-        <w:pStyle w:val="ListNumber"/>
+        <w:tabs>
+          <w:tab w:pos="425" w:val="left"/>
+        </w:tabs>
+        <w:ind w:left="425" w:hanging="425"/>
       </w:pPr>
+      <w:r>
+        <w:rPr>
+          <w:b/>
+          <w:color w:val="0F8B8D"/>
+        </w:rPr>
+        <w:t>5.</w:t>
+        <w:tab/>
+      </w:r>
       <w:r>
         <w:t>Add the name to the workflow's default exchange list.</w:t>
       </w:r>

</xml_diff>